<commit_message>
Integrate canonical 3T performance evidence into publisher
</commit_message>
<xml_diff>
--- a/paper/tables/table01_reference_implementation.docx
+++ b/paper/tables/table01_reference_implementation.docx
@@ -90,7 +90,7 @@
                 <w:b w:val="0"/>
                 <w:sz w:val="16"/>
               </w:rPr>
-              <w:t>1 &lt;= n &lt;= 10^12</w:t>
+              <w:t>1 &lt;= n &lt;= 3,000,000,000,000</w:t>
             </w:r>
           </w:p>
         </w:tc>
@@ -126,7 +126,7 @@
                 <w:b w:val="0"/>
                 <w:sz w:val="16"/>
               </w:rPr>
-              <w:t>37,607,912,018</w:t>
+              <w:t>108,340,298,703</w:t>
             </w:r>
           </w:p>
         </w:tc>
@@ -162,7 +162,7 @@
                 <w:b w:val="0"/>
                 <w:sz w:val="16"/>
               </w:rPr>
-              <w:t>999,999,999,989</w:t>
+              <w:t>2,999,999,999,933</w:t>
             </w:r>
           </w:p>
         </w:tc>
@@ -198,7 +198,7 @@
                 <w:b w:val="0"/>
                 <w:sz w:val="16"/>
               </w:rPr>
-              <w:t>100</w:t>
+              <w:t>300</w:t>
             </w:r>
           </w:p>
         </w:tc>
@@ -234,7 +234,7 @@
                 <w:b w:val="0"/>
                 <w:sz w:val="16"/>
               </w:rPr>
-              <w:t>10^10 integers</w:t>
+              <w:t>10,000,000,000 integers</w:t>
             </w:r>
           </w:p>
         </w:tc>
@@ -270,7 +270,7 @@
                 <w:b w:val="0"/>
                 <w:sz w:val="16"/>
               </w:rPr>
-              <w:t>100/100 passed</w:t>
+              <w:t>300/300 passed; SHA-256 certified</w:t>
             </w:r>
           </w:p>
         </w:tc>

</xml_diff>